<commit_message>
Update use_case_diagram.png to standard 2 human actors with Node 1, 2, 3 inside boundary
</commit_message>
<xml_diff>
--- a/Dokumentasi_UI_dan_Diagram_Sistem.docx
+++ b/Dokumentasi_UI_dan_Diagram_Sistem.docx
@@ -614,7 +614,7 @@
       <w:r>
         <w:drawing>
           <wp:inline xmlns:a="http://schemas.openxmlformats.org/drawingml/2006/main" xmlns:pic="http://schemas.openxmlformats.org/drawingml/2006/picture">
-            <wp:extent cx="5669280" cy="3234153"/>
+            <wp:extent cx="5669280" cy="3401568"/>
             <wp:docPr id="7" name="Picture 7"/>
             <wp:cNvGraphicFramePr>
               <a:graphicFrameLocks noChangeAspect="1"/>
@@ -635,7 +635,7 @@
                   <pic:spPr>
                     <a:xfrm>
                       <a:off x="0" y="0"/>
-                      <a:ext cx="5669280" cy="3234153"/>
+                      <a:ext cx="5669280" cy="3401568"/>
                     </a:xfrm>
                     <a:prstGeom prst="rect"/>
                   </pic:spPr>

</xml_diff>

<commit_message>
Update Use Case diagram to clean generalization layout (monochrome white background)
</commit_message>
<xml_diff>
--- a/Dokumentasi_UI_dan_Diagram_Sistem.docx
+++ b/Dokumentasi_UI_dan_Diagram_Sistem.docx
@@ -614,7 +614,7 @@
       <w:r>
         <w:drawing>
           <wp:inline xmlns:a="http://schemas.openxmlformats.org/drawingml/2006/main" xmlns:pic="http://schemas.openxmlformats.org/drawingml/2006/picture">
-            <wp:extent cx="5669280" cy="3401568"/>
+            <wp:extent cx="5669280" cy="3977640"/>
             <wp:docPr id="7" name="Picture 7"/>
             <wp:cNvGraphicFramePr>
               <a:graphicFrameLocks noChangeAspect="1"/>
@@ -635,7 +635,7 @@
                   <pic:spPr>
                     <a:xfrm>
                       <a:off x="0" y="0"/>
-                      <a:ext cx="5669280" cy="3401568"/>
+                      <a:ext cx="5669280" cy="3977640"/>
                     </a:xfrm>
                     <a:prstGeom prst="rect"/>
                   </pic:spPr>

</xml_diff>